<commit_message>
fix(relevamientos): "Ninguna" exclusiva en SIPH y PDF sin la indicación del área (#2651)
- pnud_formularios.json: mejoras y dificultades marcan opcionExclusiva "Ninguna";
  nuevo helper opciones_exclusivas().
- API territorial PNUD: el alta y la corrección devuelven 400 si "Ninguna" viene
  junto con otras opciones.
- Plantilla seguimiento_siph.docx: se quita la indicación "Incorporar en este
  apartado..." del punto 9 y queda solo el título COMENTARIOS FINALES.
  armar_plantilla_siph.py aplica el mismo paso y suma --quitar-instruccion para
  corregir la plantilla ya generada sin el docx original.
- Tests de regresión.

Co-Authored-By: Claude Opus 5.5 <noreply@anthropic.com>
</commit_message>
<xml_diff>
--- a/src/backends/comedores/relevamientos/templates/relevamientos/docx/seguimiento_siph.docx
+++ b/src/backends/comedores/relevamientos/templates/relevamientos/docx/seguimiento_siph.docx
@@ -3314,34 +3314,7 @@
           <w:b/>
           <w:bCs/>
         </w:rPr>
-        <w:t xml:space="preserve">COMENTARIOS FINALES. </w:t>
-      </w:r>
-      <w:r>
-        <w:t xml:space="preserve">Incorporar en este apartado toda aquella información que refiera a las actividades SIPH brindadas por el espacio comunitario, así como una ampliación de lo consignado en las preguntas previas. </w:t>
-      </w:r>
-      <w:r>
-        <w:t>Es decir, t</w:t>
-      </w:r>
-      <w:r>
-        <w:t xml:space="preserve">odo lo que aporte información </w:t>
-      </w:r>
-      <w:r>
-        <w:t xml:space="preserve">pertinente </w:t>
-      </w:r>
-      <w:r>
-        <w:t>sobre el funcionamiento de la</w:t>
-      </w:r>
-      <w:r>
-        <w:t>s</w:t>
-      </w:r>
-      <w:r>
-        <w:t xml:space="preserve"> actividades de Servicios Integrales de Promoción Humana</w:t>
-      </w:r>
-      <w:r>
-        <w:t xml:space="preserve"> (p</w:t>
-      </w:r>
-      <w:r>
-        <w:t>or ejemplo, diferenciación de recursos en cada una de las actividades, modificaciones en cuanto a los días y horarios de las actividades, etc.).</w:t>
+        <w:t xml:space="preserve">COMENTARIOS FINALES</w:t>
       </w:r>
     </w:p>
     <w:p>

</xml_diff>